<commit_message>
Fix memo option label; mark wallet decisions superseded; add third review (30 Oct 2026)
Co-Authored-By: Claude Opus 5.5 <noreply@anthropic.com>
Claude-Session: https://claude.ai/code/session_01Bpzt23dnJQRXixhCLMoUgQ
</commit_message>
<xml_diff>
--- a/docs/legal/RemonLogic_Legal_Memo_for_Lawyer_Review.docx
+++ b/docs/legal/RemonLogic_Legal_Memo_for_Lawyer_Review.docx
@@ -499,7 +499,7 @@
         <w:rPr>
           <w:rFonts w:ascii="Aptos" w:cs="Aptos" w:eastAsia="Aptos" w:hAnsi="Aptos"/>
         </w:rPr>
-        <w:t xml:space="preserve"> the company will NOT hold customers' money as a stored balance or wallet. Use </w:t>
+        <w:t xml:space="preserve"> the company will NOT hold customers' money as a stored balance or wallet. In this memo that is </w:t>
       </w:r>
       <w:r>
         <w:rPr>
@@ -507,13 +507,13 @@
           <w:b/>
           <w:bCs/>
         </w:rPr>
-        <w:t xml:space="preserve">Option B</w:t>
-      </w:r>
-      <w:r>
-        <w:rPr>
-          <w:rFonts w:ascii="Aptos" w:cs="Aptos" w:eastAsia="Aptos" w:hAnsi="Aptos"/>
-        </w:rPr>
-        <w:t xml:space="preserve"> (pay per order / per plan, no stored balance) wherever two options are given; Option A is kept only for the lawyer's reference. Customer disputes: AI support first, then email to a person who decides — aligned between NexaTute and Remon Motion Studio.</w:t>
+        <w:t xml:space="preserve">Option A of chapter 2 (pay per order / per plan, no stored balance)</w:t>
+      </w:r>
+      <w:r>
+        <w:rPr>
+          <w:rFonts w:ascii="Aptos" w:cs="Aptos" w:eastAsia="Aptos" w:hAnsi="Aptos"/>
+        </w:rPr>
+        <w:t xml:space="preserve"> — note the website-pages drafts label the same choice "Option B". Credits, minute packs, reseller packs, NexaLogicDev credits and gift cards must not become a Taka balance. Customer disputes: AI support first, then email to a person who decides — aligned between NexaTute and Remon Motion Studio.</w:t>
       </w:r>
     </w:p>
     <w:tbl>

</xml_diff>